<commit_message>
b75: journal rows are closing DEALS, not positions — weekly report overstated trades
Root cause: engines/learning.journal() writes one row per closing deal, so a
position closed in parts (partial TPs) produced several rows. weekly_report.py
counted rows and reported "34 trades" for 23 actual positions, and used gross
profit (196.00) instead of net (191.02).

- learning: journal now records position_id, commission, swap; legacy files are
  migrated in place (backfilled from broker deal history by ticket)
- learning: position_count() / group_positions() aggregate by position_id and
  expose net = gross + commission + swap
- weekly_report: report positions and net P&L, not deal rows and gross
- verified against broker: 24 positions, net +191.02 (was reported as 34/+196)
- report builders: derive repo path and hosts from __file__/bridge_client/OS
  instead of literals (b64/b66); drop superseded v1 generator and docx
</commit_message>
<xml_diff>
--- a/reports/Hermes_System_Report_Full_1405-06-13.docx
+++ b/reports/Hermes_System_Report_Full_1405-06-13.docx
@@ -772,7 +772,7 @@
                 <w:sz w:val="19"/>
                 <w:szCs w:val="19"/>
               </w:rPr>
-              <w:t>در نسخهٔ قبلی این گزارش، عملکرد به‌صورت «۳۴ ترید / ۱۹۶+ دلار» اعلام شد. آن اعداد نادرست بودند: ۳۴ تعداد «دیل‌های» بروکر بود، نه تعداد پوزیشن (هر پوزیشن یک دیل باز کردن و یک یا چند دیل بستن دارد). با تجمیع بر اساس position_id، ارقام صحیح به‌دست آمد: ۲۳ پوزیشن، سود ناخالص ۱۸۶.۱۰ دلار، کارمزد ۹.۹۰- دلار، و سود خالص ۱۷۶.۲۰ دلار. همهٔ اعداد عملکرد در این نسخه از همین روش استخراج شده‌اند.</w:t>
+              <w:t>در نسخهٔ قبلی این گزارش، عملکرد به‌صورت «۳۴ ترید / ۱۹۶+ دلار» اعلام شد. آن اعداد نادرست بودند: ۳۴ تعداد «دیل‌های» بروکر بود، نه تعداد پوزیشن (هر پوزیشن یک دیل باز کردن و یک یا چند دیل بستن دارد). با تجمیع بر اساس position_id، ارقام صحیح به‌دست آمد: ۲۴ پوزیشن، سود ناخالص ۱۹۶.۰۰ دلار، کارمزد ۴.۹۸- دلار، و سود خالص ۱۹۱.۰۲ دلار. همهٔ اعداد عملکرد در این نسخه از همین روش استخراج شده‌اند.</w:t>
             </w:r>
           </w:p>
         </w:tc>
@@ -937,7 +937,7 @@
           <w:sz w:val="21"/>
           <w:szCs w:val="21"/>
         </w:rPr>
-        <w:t>در ۱۳ روز اخیر ۲۳ پوزیشن توسط موتور داخلی باز و بسته شده است: ۱۷ برد و ۶ باخت، سود خالص ۱۷۶.۲۰ دلار پس از کسر کارمزد، و افت سرمایهٔ حداکثری ۱۶۷.۱۳- دلار. این سود عمدتاً از یک برد بزرگ (۸۴+ دلار) و چند برد متوسط آمده، نه از تداوم سود.</w:t>
+        <w:t>در ۱۲ روز اخیر ۲۴ پوزیشن توسط موتور داخلی باز و بسته شده است: ۱۸ برد و ۶ باخت، سود خالص ۱۹۱.۰۲ دلار پس از کسر کارمزد، و افت سرمایهٔ حداکثری ۱۶۸.۴۸- دلار. این سود عمدتاً از چند برد بزرگ (بیشترین ۸۳.۹۷ دلار) آمده، نه از شیب پیوسته؛ و یک باخت ۱۰۵.۶۰- تنها ۵۵٪ کل سود دوره را می‌بلعد.</w:t>
       </w:r>
     </w:p>
     <w:p>
@@ -1025,7 +1025,7 @@
                 <w:sz w:val="19"/>
                 <w:szCs w:val="19"/>
               </w:rPr>
-              <w:t>۲۲ رویداد پردازش سیگنال از ۲۸ آگوست ثبت شده و هیچ‌کدام به اجرا نرسیده (executed=True = صفر). همهٔ ۲۳ پوزیشن واقعی از موتور تحلیل داخلی (hermes_master) آمده‌اند، نه از کانال‌ها. گیت امتیازدهی با آستانهٔ ۶ از ۱۰، عملاً هر سیگنال کانال را رد می‌کند. این یعنی دو گزاره که قبلاً یکی فرض می‌شدند از هم جدا می‌شوند: «گیت از ما محافظت می‌کند» و «گیت ما را از سود محروم می‌کند». با ۲۲ نمونه نمی‌توان تشخیص داد کدام درست است — و به همین دلیل تصمیم بر «دست نزدن» و جمع‌آوری داده باقی ماند.</w:t>
+              <w:t>۲۲ رویداد پردازش سیگنال از ۲۸ آگوست ثبت شده و هیچ‌کدام به اجرا نرسیده (executed=True = صفر). همهٔ ۲۴ پوزیشن واقعی از موتور تحلیل داخلی (hermes_master) آمده‌اند، نه از کانال‌ها. گیت امتیازدهی با آستانهٔ ۶ از ۱۰، عملاً هر سیگنال کانال را رد می‌کند. این یعنی دو گزاره که قبلاً یکی فرض می‌شدند از هم جدا می‌شوند: «گیت از ما محافظت می‌کند» و «گیت ما را از سود محروم می‌کند». با ۲۲ نمونه نمی‌توان تشخیص داد کدام درست است — و به همین دلیل تصمیم بر «دست نزدن» و جمع‌آوری داده باقی ماند.</w:t>
             </w:r>
           </w:p>
         </w:tc>
@@ -1556,7 +1556,7 @@
                 <w:sz w:val="19"/>
                 <w:szCs w:val="19"/>
               </w:rPr>
-              <w:t>خیر — ۲۳ پوزیشن برای نتیجه‌گیری کافی نیست</w:t>
+              <w:t>خیر — ۲۴ پوزیشن برای نتیجه‌گیری کافی نیست</w:t>
             </w:r>
           </w:p>
         </w:tc>
@@ -1653,7 +1653,7 @@
                 <w:sz w:val="19"/>
                 <w:szCs w:val="19"/>
               </w:rPr>
-              <w:t>آیا پروفایل ریسک (میانگین باخت ۵۸- در برابر برد ۳۱+) اصلاح شود؟</w:t>
+              <w:t>آیا پروفایل ریسک (میانگین باخت ۵۸.۳۱- در برابر برد ۳۰.۰۵+) اصلاح شود؟</w:t>
             </w:r>
           </w:p>
         </w:tc>
@@ -2104,7 +2104,7 @@
                 <w:sz w:val="30"/>
                 <w:szCs w:val="30"/>
               </w:rPr>
-              <w:t>$176.20</w:t>
+              <w:t>+$191.02</w:t>
             </w:r>
           </w:p>
         </w:tc>
@@ -2136,7 +2136,7 @@
                 <w:sz w:val="30"/>
                 <w:szCs w:val="30"/>
               </w:rPr>
-              <w:t>73.9%</w:t>
+              <w:t>75.0%</w:t>
             </w:r>
           </w:p>
         </w:tc>
@@ -2168,7 +2168,7 @@
                 <w:sz w:val="30"/>
                 <w:szCs w:val="30"/>
               </w:rPr>
-              <w:t>-$167.13</w:t>
+              <w:t>-$168.48</w:t>
             </w:r>
           </w:p>
         </w:tc>
@@ -2234,7 +2234,7 @@
                 <w:sz w:val="16"/>
                 <w:szCs w:val="16"/>
               </w:rPr>
-              <w:t>سود خالص ۱۳ روز</w:t>
+              <w:t>سود خالص ۱۲ روز</w:t>
             </w:r>
           </w:p>
         </w:tc>
@@ -5962,6 +5962,65 @@
     </w:p>
     <w:p>
       <w:pPr>
+        <w:bidi w:val="1"/>
+        <w:spacing w:before="80" w:after="40"/>
+        <w:jc w:val="center"/>
+      </w:pPr>
+      <w:r>
+        <w:drawing>
+          <wp:inline xmlns:a="http://schemas.openxmlformats.org/drawingml/2006/main" xmlns:pic="http://schemas.openxmlformats.org/drawingml/2006/picture">
+            <wp:extent cx="6408000" cy="3745804"/>
+            <wp:docPr id="1" name="Picture 1"/>
+            <wp:cNvGraphicFramePr>
+              <a:graphicFrameLocks noChangeAspect="1"/>
+            </wp:cNvGraphicFramePr>
+            <a:graphic>
+              <a:graphicData uri="http://schemas.openxmlformats.org/drawingml/2006/picture">
+                <pic:pic>
+                  <pic:nvPicPr>
+                    <pic:cNvPr id="0" name="chart_arch.png"/>
+                    <pic:cNvPicPr/>
+                  </pic:nvPicPr>
+                  <pic:blipFill>
+                    <a:blip r:embed="rId11"/>
+                    <a:stretch>
+                      <a:fillRect/>
+                    </a:stretch>
+                  </pic:blipFill>
+                  <pic:spPr>
+                    <a:xfrm>
+                      <a:off x="0" y="0"/>
+                      <a:ext cx="6408000" cy="3745804"/>
+                    </a:xfrm>
+                    <a:prstGeom prst="rect"/>
+                  </pic:spPr>
+                </pic:pic>
+              </a:graphicData>
+            </a:graphic>
+          </wp:inline>
+        </w:drawing>
+      </w:r>
+    </w:p>
+    <w:p>
+      <w:pPr>
+        <w:bidi w:val="1"/>
+        <w:spacing w:after="200"/>
+        <w:jc w:val="center"/>
+      </w:pPr>
+      <w:r>
+        <w:rPr>
+          <w:rFonts w:ascii="Tahoma" w:hAnsi="Tahoma" w:cs="Tahoma" w:eastAsia="Tahoma"/>
+          <w:b w:val="0"/>
+          <w:i/>
+          <w:color w:val="595959"/>
+          <w:sz w:val="17"/>
+          <w:szCs w:val="17"/>
+        </w:rPr>
+        <w:t>شکل ۱ — معماری و جریان کنترل/داده. مسیر بالایی سیگنال تلگرام است (که تاکنون صفر اجرا داده) و مسیر میانی موتور تحلیل داخلی (که هر ۲۴ پوزیشن واقعی از آن آمده).</w:t>
+      </w:r>
+    </w:p>
+    <w:p>
+      <w:pPr>
         <w:pStyle w:val="Heading2"/>
         <w:bidi w:val="1"/>
         <w:spacing w:before="220" w:after="80"/>
@@ -7395,7 +7454,7 @@
           <w:sz w:val="20"/>
           <w:szCs w:val="20"/>
         </w:rPr>
-        <w:t>موتوری که تمام ۲۳ ترید واقعی از آن آمده است. برخلاف مسیر سیگنال، اینجا سیستم خودش بازار را می‌خواند و پلن می‌سازد:</w:t>
+        <w:t>موتوری که تمام ۲۴ ترید واقعی از آن آمده است. برخلاف مسیر سیگنال، اینجا سیستم خودش بازار را می‌خواند و پلن می‌سازد:</w:t>
       </w:r>
     </w:p>
     <w:tbl>
@@ -14336,7 +14395,7 @@
                 <w:sz w:val="19"/>
                 <w:szCs w:val="19"/>
               </w:rPr>
-              <w:t>کانال اصلی — ۶۶۷ پا در رپلی</w:t>
+              <w:t>کانال اصلی — ۷۱۶ پا در رپلی</w:t>
             </w:r>
           </w:p>
         </w:tc>
@@ -20659,7 +20718,7 @@
           <w:sz w:val="29"/>
           <w:szCs w:val="29"/>
         </w:rPr>
-        <w:t>۸. عملکرد — ۲۳ پوزیشن در ۱۳ روز</w:t>
+        <w:t>۸. عملکرد — ۲۴ پوزیشن در ۱۲ روز</w:t>
       </w:r>
     </w:p>
     <w:p>
@@ -20749,7 +20808,7 @@
                 <w:sz w:val="30"/>
                 <w:szCs w:val="30"/>
               </w:rPr>
-              <w:t>23</w:t>
+              <w:t>24</w:t>
             </w:r>
           </w:p>
         </w:tc>
@@ -20781,7 +20840,7 @@
                 <w:sz w:val="30"/>
                 <w:szCs w:val="30"/>
               </w:rPr>
-              <w:t>+176.20$</w:t>
+              <w:t>+191.02$</w:t>
             </w:r>
           </w:p>
         </w:tc>
@@ -20813,7 +20872,7 @@
                 <w:sz w:val="30"/>
                 <w:szCs w:val="30"/>
               </w:rPr>
-              <w:t>73.9%</w:t>
+              <w:t>75.0%</w:t>
             </w:r>
           </w:p>
         </w:tc>
@@ -20845,7 +20904,7 @@
                 <w:sz w:val="30"/>
                 <w:szCs w:val="30"/>
               </w:rPr>
-              <w:t>-$167.13</w:t>
+              <w:t>-$168.48</w:t>
             </w:r>
           </w:p>
         </w:tc>
@@ -21136,7 +21195,7 @@
                 <w:sz w:val="19"/>
                 <w:szCs w:val="19"/>
               </w:rPr>
-              <w:t>پوزیشن باز شده</w:t>
+              <w:t>پوزیشن باز و بسته‌شده</w:t>
             </w:r>
           </w:p>
         </w:tc>
@@ -21167,7 +21226,7 @@
                 <w:sz w:val="19"/>
                 <w:szCs w:val="19"/>
               </w:rPr>
-              <w:t>23</w:t>
+              <w:t>24</w:t>
             </w:r>
           </w:p>
         </w:tc>
@@ -21198,7 +21257,7 @@
                 <w:sz w:val="19"/>
                 <w:szCs w:val="19"/>
               </w:rPr>
-              <w:t>همه بسته — صفر باز</w:t>
+              <w:t>۲۴ ورود / ۳۴ خروج — همه بسته، صفر باز</w:t>
             </w:r>
           </w:p>
         </w:tc>
@@ -21264,7 +21323,7 @@
                 <w:sz w:val="19"/>
                 <w:szCs w:val="19"/>
               </w:rPr>
-              <w:t>17 / 6</w:t>
+              <w:t>18 / 6</w:t>
             </w:r>
           </w:p>
         </w:tc>
@@ -21296,7 +21355,7 @@
                 <w:sz w:val="19"/>
                 <w:szCs w:val="19"/>
               </w:rPr>
-              <w:t>نرخ برد ۷۳.۹٪</w:t>
+              <w:t>نرخ برد ۷۵.۰٪</w:t>
             </w:r>
           </w:p>
         </w:tc>
@@ -21360,7 +21419,7 @@
                 <w:sz w:val="19"/>
                 <w:szCs w:val="19"/>
               </w:rPr>
-              <w:t>+$186.10</w:t>
+              <w:t>+$196.00</w:t>
             </w:r>
           </w:p>
         </w:tc>
@@ -21457,7 +21516,7 @@
                 <w:sz w:val="19"/>
                 <w:szCs w:val="19"/>
               </w:rPr>
-              <w:t>-$9.90</w:t>
+              <w:t>-$4.98</w:t>
             </w:r>
           </w:p>
         </w:tc>
@@ -21553,7 +21612,7 @@
                 <w:sz w:val="19"/>
                 <w:szCs w:val="19"/>
               </w:rPr>
-              <w:t>+$176.20</w:t>
+              <w:t>+$191.02</w:t>
             </w:r>
           </w:p>
         </w:tc>
@@ -21650,7 +21709,7 @@
                 <w:sz w:val="19"/>
                 <w:szCs w:val="19"/>
               </w:rPr>
-              <w:t>+$31.43</w:t>
+              <w:t>+$30.05</w:t>
             </w:r>
           </w:p>
         </w:tc>
@@ -21746,7 +21805,7 @@
                 <w:sz w:val="19"/>
                 <w:szCs w:val="19"/>
               </w:rPr>
-              <w:t>-$58.04</w:t>
+              <w:t>-$58.31</w:t>
             </w:r>
           </w:p>
         </w:tc>
@@ -21777,7 +21836,7 @@
                 <w:sz w:val="19"/>
                 <w:szCs w:val="19"/>
               </w:rPr>
-              <w:t>۱.۸۵ برابر بزرگ‌تر از برد</w:t>
+              <w:t>۱.۹۴ برابر بزرگ‌تر از برد</w:t>
             </w:r>
           </w:p>
         </w:tc>
@@ -21843,7 +21902,7 @@
                 <w:sz w:val="19"/>
                 <w:szCs w:val="19"/>
               </w:rPr>
-              <w:t>+$84.24 / -$105.15</w:t>
+              <w:t>+$83.97 / -$105.60</w:t>
             </w:r>
           </w:p>
         </w:tc>
@@ -21875,7 +21934,7 @@
                 <w:sz w:val="19"/>
                 <w:szCs w:val="19"/>
               </w:rPr>
-              <w:t>یک ترید ۴۸٪ سود کل</w:t>
+              <w:t>بدترین، ۵۵٪ سود کل را می‌بلعد</w:t>
             </w:r>
           </w:p>
         </w:tc>
@@ -21939,7 +21998,7 @@
                 <w:sz w:val="19"/>
                 <w:szCs w:val="19"/>
               </w:rPr>
-              <w:t>-$167.13</w:t>
+              <w:t>-$168.48</w:t>
             </w:r>
           </w:p>
         </w:tc>
@@ -22004,7 +22063,7 @@
                 <w:sz w:val="19"/>
                 <w:szCs w:val="19"/>
               </w:rPr>
-              <w:t>لات مصرفی</w:t>
+              <w:t>پوزیشن چندپایه (TP جزئی)</w:t>
             </w:r>
           </w:p>
         </w:tc>
@@ -22036,7 +22095,7 @@
                 <w:sz w:val="19"/>
                 <w:szCs w:val="19"/>
               </w:rPr>
-              <w:t>0.01 تا 0.16</w:t>
+              <w:t>7 از 24</w:t>
             </w:r>
           </w:p>
         </w:tc>
@@ -22068,7 +22127,7 @@
                 <w:sz w:val="19"/>
                 <w:szCs w:val="19"/>
               </w:rPr>
-              <w:t>میانگین 0.072 — متغیر</w:t>
+              <w:t>حداکثر ۳ پایه در یک پوزیشن</w:t>
             </w:r>
           </w:p>
         </w:tc>
@@ -22101,7 +22160,7 @@
                 <w:sz w:val="19"/>
                 <w:szCs w:val="19"/>
               </w:rPr>
-              <w:t>سود نرمال‌شده @0.01</w:t>
+              <w:t>لات مصرفی</w:t>
             </w:r>
           </w:p>
         </w:tc>
@@ -22132,7 +22191,7 @@
                 <w:sz w:val="19"/>
                 <w:szCs w:val="19"/>
               </w:rPr>
-              <w:t>+$44.21</w:t>
+              <w:t>0.01 تا 0.16</w:t>
             </w:r>
           </w:p>
         </w:tc>
@@ -22163,7 +22222,7 @@
                 <w:sz w:val="19"/>
                 <w:szCs w:val="19"/>
               </w:rPr>
-              <w:t>برابر‌سازی حجم</w:t>
+              <w:t>میانگین 0.057 — متغیر</w:t>
             </w:r>
           </w:p>
         </w:tc>
@@ -22197,7 +22256,7 @@
                 <w:sz w:val="19"/>
                 <w:szCs w:val="19"/>
               </w:rPr>
-              <w:t>روزهای فعال</w:t>
+              <w:t>سود نرمال‌شده @0.01</w:t>
             </w:r>
           </w:p>
         </w:tc>
@@ -22229,7 +22288,7 @@
                 <w:sz w:val="19"/>
                 <w:szCs w:val="19"/>
               </w:rPr>
-              <w:t>6 از 13</w:t>
+              <w:t>+$67.39</w:t>
             </w:r>
           </w:p>
         </w:tc>
@@ -22261,7 +22320,102 @@
                 <w:sz w:val="19"/>
                 <w:szCs w:val="19"/>
               </w:rPr>
-              <w:t>بازار بسته یا بدون ستاپ</w:t>
+              <w:t>برابر‌سازی حجم</w:t>
+            </w:r>
+          </w:p>
+        </w:tc>
+      </w:tr>
+      <w:tr>
+        <w:tc>
+          <w:tcPr>
+            <w:tcW w:type="dxa" w:w="2381"/>
+            <w:vAlign w:val="center"/>
+            <w:tcMar>
+              <w:top w:w="60" w:type="dxa"/>
+              <w:bottom w:w="60" w:type="dxa"/>
+              <w:start w:w="90" w:type="dxa"/>
+              <w:end w:w="90" w:type="dxa"/>
+            </w:tcMar>
+          </w:tcPr>
+          <w:p>
+            <w:pPr>
+              <w:bidi w:val="1"/>
+              <w:spacing w:after="20" w:before="20"/>
+              <w:jc w:val="right"/>
+            </w:pPr>
+            <w:r/>
+            <w:r>
+              <w:rPr>
+                <w:rFonts w:ascii="Tahoma" w:hAnsi="Tahoma" w:cs="Tahoma" w:eastAsia="Tahoma"/>
+                <w:b w:val="0"/>
+                <w:i w:val="0"/>
+                <w:color w:val="262626"/>
+                <w:sz w:val="19"/>
+                <w:szCs w:val="19"/>
+              </w:rPr>
+              <w:t>پنجرهٔ زمانی</w:t>
+            </w:r>
+          </w:p>
+        </w:tc>
+        <w:tc>
+          <w:tcPr>
+            <w:tcW w:type="dxa" w:w="1928"/>
+            <w:vAlign w:val="center"/>
+            <w:tcMar>
+              <w:top w:w="60" w:type="dxa"/>
+              <w:bottom w:w="60" w:type="dxa"/>
+              <w:start w:w="90" w:type="dxa"/>
+              <w:end w:w="90" w:type="dxa"/>
+            </w:tcMar>
+          </w:tcPr>
+          <w:p>
+            <w:pPr>
+              <w:bidi w:val="1"/>
+              <w:spacing w:after="20" w:before="20"/>
+              <w:jc w:val="center"/>
+            </w:pPr>
+            <w:r/>
+            <w:r>
+              <w:rPr>
+                <w:rFonts w:ascii="Tahoma" w:hAnsi="Tahoma" w:cs="Tahoma" w:eastAsia="Tahoma"/>
+                <w:b w:val="0"/>
+                <w:i w:val="0"/>
+                <w:color w:val="262626"/>
+                <w:sz w:val="19"/>
+                <w:szCs w:val="19"/>
+              </w:rPr>
+              <w:t>21 آگوست تا 3 سپتامبر</w:t>
+            </w:r>
+          </w:p>
+        </w:tc>
+        <w:tc>
+          <w:tcPr>
+            <w:tcW w:type="dxa" w:w="4649"/>
+            <w:vAlign w:val="center"/>
+            <w:tcMar>
+              <w:top w:w="60" w:type="dxa"/>
+              <w:bottom w:w="60" w:type="dxa"/>
+              <w:start w:w="90" w:type="dxa"/>
+              <w:end w:w="90" w:type="dxa"/>
+            </w:tcMar>
+          </w:tcPr>
+          <w:p>
+            <w:pPr>
+              <w:bidi w:val="1"/>
+              <w:spacing w:after="20" w:before="20"/>
+              <w:jc w:val="right"/>
+            </w:pPr>
+            <w:r/>
+            <w:r>
+              <w:rPr>
+                <w:rFonts w:ascii="Tahoma" w:hAnsi="Tahoma" w:cs="Tahoma" w:eastAsia="Tahoma"/>
+                <w:b w:val="0"/>
+                <w:i w:val="0"/>
+                <w:color w:val="262626"/>
+                <w:sz w:val="19"/>
+                <w:szCs w:val="19"/>
+              </w:rPr>
+              <w:t>۱۲ روز</w:t>
             </w:r>
           </w:p>
         </w:tc>
@@ -22291,8 +22445,8 @@
       <w:r>
         <w:drawing>
           <wp:inline xmlns:a="http://schemas.openxmlformats.org/drawingml/2006/main" xmlns:pic="http://schemas.openxmlformats.org/drawingml/2006/picture">
-            <wp:extent cx="6408000" cy="2527099"/>
-            <wp:docPr id="1" name="Picture 1"/>
+            <wp:extent cx="6408000" cy="2563200"/>
+            <wp:docPr id="2" name="Picture 2"/>
             <wp:cNvGraphicFramePr>
               <a:graphicFrameLocks noChangeAspect="1"/>
             </wp:cNvGraphicFramePr>
@@ -22304,7 +22458,7 @@
                     <pic:cNvPicPr/>
                   </pic:nvPicPr>
                   <pic:blipFill>
-                    <a:blip r:embed="rId11"/>
+                    <a:blip r:embed="rId12"/>
                     <a:stretch>
                       <a:fillRect/>
                     </a:stretch>
@@ -22312,7 +22466,7 @@
                   <pic:spPr>
                     <a:xfrm>
                       <a:off x="0" y="0"/>
-                      <a:ext cx="6408000" cy="2527099"/>
+                      <a:ext cx="6408000" cy="2563200"/>
                     </a:xfrm>
                     <a:prstGeom prst="rect"/>
                   </pic:spPr>
@@ -22338,7 +22492,7 @@
           <w:sz w:val="17"/>
           <w:szCs w:val="17"/>
         </w:rPr>
-        <w:t>شکل ۱ — منحنی سود تجمعی ۲۳ پوزیشن. سود عمدتاً از یک پلهٔ بزرگ می‌آید، نه شیب پیوسته.</w:t>
+        <w:t>شکل ۲ — منحنی سود تجمعی ۲۴ پوزیشن بسته (خالص از کارمزد). سود عمدتاً از چند پلهٔ بزرگ می‌آید، نه شیب پیوسته.</w:t>
       </w:r>
     </w:p>
     <w:p>
@@ -22350,8 +22504,8 @@
       <w:r>
         <w:drawing>
           <wp:inline xmlns:a="http://schemas.openxmlformats.org/drawingml/2006/main" xmlns:pic="http://schemas.openxmlformats.org/drawingml/2006/picture">
-            <wp:extent cx="6408000" cy="2256338"/>
-            <wp:docPr id="2" name="Picture 2"/>
+            <wp:extent cx="6408000" cy="2291128"/>
+            <wp:docPr id="3" name="Picture 3"/>
             <wp:cNvGraphicFramePr>
               <a:graphicFrameLocks noChangeAspect="1"/>
             </wp:cNvGraphicFramePr>
@@ -22363,7 +22517,7 @@
                     <pic:cNvPicPr/>
                   </pic:nvPicPr>
                   <pic:blipFill>
-                    <a:blip r:embed="rId12"/>
+                    <a:blip r:embed="rId13"/>
                     <a:stretch>
                       <a:fillRect/>
                     </a:stretch>
@@ -22371,7 +22525,7 @@
                   <pic:spPr>
                     <a:xfrm>
                       <a:off x="0" y="0"/>
-                      <a:ext cx="6408000" cy="2256338"/>
+                      <a:ext cx="6408000" cy="2291128"/>
                     </a:xfrm>
                     <a:prstGeom prst="rect"/>
                   </pic:spPr>
@@ -22397,7 +22551,7 @@
           <w:sz w:val="17"/>
           <w:szCs w:val="17"/>
         </w:rPr>
-        <w:t>شکل ۲ — نتیجهٔ تک‌تک پوزیشن‌ها. تعداد برد زیاد است اما عمق باخت‌ها بیشتر از ارتفاع بردهاست.</w:t>
+        <w:t>شکل ۳ — نتیجهٔ تک‌تک ۲۴ پوزیشن. تعداد برد زیاد است (۱۸) اما عمق باخت‌ها (میانگین ۵۸-) از ارتفاع بردها (میانگین ۳۰+) بیشتر است.</w:t>
       </w:r>
     </w:p>
     <w:p>
@@ -22485,7 +22639,7 @@
                 <w:sz w:val="19"/>
                 <w:szCs w:val="19"/>
               </w:rPr>
-              <w:t>نرخ برد ۷۳.۹٪ خوب است، اما ترکیب آن با میانگین باخت ۵۸- در برابر میانگین برد ۳۱+ یعنی سیستم با یک باخت بد، سه برد را پاک می‌کند. بدون آن برد ۸۴+ دلاری، سود خالص به حدود ۹۲ دلار می‌رسید. این تنها ضعف ساختاری است که در داده تأیید شده و تنها موردی است که پیشنهاد بازنگری جدی دارد (تصمیم D-4).</w:t>
+              <w:t>نرخ برد ۷۵.۰٪ خوب است، اما ترکیب آن با میانگین باخت ۵۸.۳۱- در برابر میانگین برد ۳۰.۰۵+ یعنی سیستم با یک باخت بد، دو تا سه برد را پاک می‌کند. بدون بدترین باخت ۱۰۵.۶۰- دلاری، سود خالص به حدود ۲۹۷ دلار می‌رسید. این تنها ضعف ساختاری است که در داده تأیید شده و تنها موردی است که پیشنهاد بازنگری جدی دارد (تصمیم D-4).</w:t>
             </w:r>
           </w:p>
         </w:tc>
@@ -22954,7 +23108,7 @@
                 <w:sz w:val="19"/>
                 <w:szCs w:val="19"/>
               </w:rPr>
-              <w:t>مجموع</w:t>
+              <w:t>TEST_WITH_SLTP</w:t>
             </w:r>
           </w:p>
         </w:tc>
@@ -22986,7 +23140,7 @@
                 <w:sz w:val="19"/>
                 <w:szCs w:val="19"/>
               </w:rPr>
-              <w:t>23</w:t>
+              <w:t>1</w:t>
             </w:r>
           </w:p>
         </w:tc>
@@ -23018,7 +23172,200 @@
                 <w:sz w:val="19"/>
                 <w:szCs w:val="19"/>
               </w:rPr>
-              <w:t>+$176.20 خالص</w:t>
+              <w:t>تست — باید حذف/شناسایی شود</w:t>
+            </w:r>
+          </w:p>
+        </w:tc>
+      </w:tr>
+      <w:tr>
+        <w:tc>
+          <w:tcPr>
+            <w:tcW w:type="dxa" w:w="2948"/>
+            <w:vAlign w:val="center"/>
+            <w:tcMar>
+              <w:top w:w="60" w:type="dxa"/>
+              <w:bottom w:w="60" w:type="dxa"/>
+              <w:start w:w="90" w:type="dxa"/>
+              <w:end w:w="90" w:type="dxa"/>
+            </w:tcMar>
+          </w:tcPr>
+          <w:p>
+            <w:pPr>
+              <w:bidi w:val="1"/>
+              <w:spacing w:after="20" w:before="20"/>
+              <w:jc w:val="right"/>
+            </w:pPr>
+            <w:r/>
+            <w:r>
+              <w:rPr>
+                <w:rFonts w:ascii="Tahoma" w:hAnsi="Tahoma" w:cs="Tahoma" w:eastAsia="Tahoma"/>
+                <w:b w:val="0"/>
+                <w:i w:val="0"/>
+                <w:color w:val="262626"/>
+                <w:sz w:val="19"/>
+                <w:szCs w:val="19"/>
+              </w:rPr>
+              <w:t>HERMES_CLOSE_DEV20</w:t>
+            </w:r>
+          </w:p>
+        </w:tc>
+        <w:tc>
+          <w:tcPr>
+            <w:tcW w:type="dxa" w:w="1361"/>
+            <w:vAlign w:val="center"/>
+            <w:tcMar>
+              <w:top w:w="60" w:type="dxa"/>
+              <w:bottom w:w="60" w:type="dxa"/>
+              <w:start w:w="90" w:type="dxa"/>
+              <w:end w:w="90" w:type="dxa"/>
+            </w:tcMar>
+          </w:tcPr>
+          <w:p>
+            <w:pPr>
+              <w:bidi w:val="1"/>
+              <w:spacing w:after="20" w:before="20"/>
+              <w:jc w:val="center"/>
+            </w:pPr>
+            <w:r/>
+            <w:r>
+              <w:rPr>
+                <w:rFonts w:ascii="Tahoma" w:hAnsi="Tahoma" w:cs="Tahoma" w:eastAsia="Tahoma"/>
+                <w:b w:val="0"/>
+                <w:i w:val="0"/>
+                <w:color w:val="262626"/>
+                <w:sz w:val="19"/>
+                <w:szCs w:val="19"/>
+              </w:rPr>
+              <w:t>1</w:t>
+            </w:r>
+          </w:p>
+        </w:tc>
+        <w:tc>
+          <w:tcPr>
+            <w:tcW w:type="dxa" w:w="4649"/>
+            <w:vAlign w:val="center"/>
+            <w:tcMar>
+              <w:top w:w="60" w:type="dxa"/>
+              <w:bottom w:w="60" w:type="dxa"/>
+              <w:start w:w="90" w:type="dxa"/>
+              <w:end w:w="90" w:type="dxa"/>
+            </w:tcMar>
+          </w:tcPr>
+          <w:p>
+            <w:pPr>
+              <w:bidi w:val="1"/>
+              <w:spacing w:after="20" w:before="20"/>
+              <w:jc w:val="right"/>
+            </w:pPr>
+            <w:r/>
+            <w:r>
+              <w:rPr>
+                <w:rFonts w:ascii="Tahoma" w:hAnsi="Tahoma" w:cs="Tahoma" w:eastAsia="Tahoma"/>
+                <w:b w:val="0"/>
+                <w:i w:val="0"/>
+                <w:color w:val="262626"/>
+                <w:sz w:val="19"/>
+                <w:szCs w:val="19"/>
+              </w:rPr>
+              <w:t>کامنت بستن</w:t>
+            </w:r>
+          </w:p>
+        </w:tc>
+      </w:tr>
+      <w:tr>
+        <w:tc>
+          <w:tcPr>
+            <w:tcW w:type="dxa" w:w="2948"/>
+            <w:vAlign w:val="center"/>
+            <w:tcMar>
+              <w:top w:w="60" w:type="dxa"/>
+              <w:bottom w:w="60" w:type="dxa"/>
+              <w:start w:w="90" w:type="dxa"/>
+              <w:end w:w="90" w:type="dxa"/>
+            </w:tcMar>
+            <w:shd w:val="clear" w:color="auto" w:fill="F2F5FA"/>
+          </w:tcPr>
+          <w:p>
+            <w:pPr>
+              <w:bidi w:val="1"/>
+              <w:spacing w:after="20" w:before="20"/>
+              <w:jc w:val="right"/>
+            </w:pPr>
+            <w:r/>
+            <w:r>
+              <w:rPr>
+                <w:rFonts w:ascii="Tahoma" w:hAnsi="Tahoma" w:cs="Tahoma" w:eastAsia="Tahoma"/>
+                <w:b w:val="0"/>
+                <w:i w:val="0"/>
+                <w:color w:val="262626"/>
+                <w:sz w:val="19"/>
+                <w:szCs w:val="19"/>
+              </w:rPr>
+              <w:t>مجموع پوزیشن</w:t>
+            </w:r>
+          </w:p>
+        </w:tc>
+        <w:tc>
+          <w:tcPr>
+            <w:tcW w:type="dxa" w:w="1361"/>
+            <w:vAlign w:val="center"/>
+            <w:tcMar>
+              <w:top w:w="60" w:type="dxa"/>
+              <w:bottom w:w="60" w:type="dxa"/>
+              <w:start w:w="90" w:type="dxa"/>
+              <w:end w:w="90" w:type="dxa"/>
+            </w:tcMar>
+            <w:shd w:val="clear" w:color="auto" w:fill="F2F5FA"/>
+          </w:tcPr>
+          <w:p>
+            <w:pPr>
+              <w:bidi w:val="1"/>
+              <w:spacing w:after="20" w:before="20"/>
+              <w:jc w:val="center"/>
+            </w:pPr>
+            <w:r/>
+            <w:r>
+              <w:rPr>
+                <w:rFonts w:ascii="Tahoma" w:hAnsi="Tahoma" w:cs="Tahoma" w:eastAsia="Tahoma"/>
+                <w:b w:val="0"/>
+                <w:i w:val="0"/>
+                <w:color w:val="262626"/>
+                <w:sz w:val="19"/>
+                <w:szCs w:val="19"/>
+              </w:rPr>
+              <w:t>24</w:t>
+            </w:r>
+          </w:p>
+        </w:tc>
+        <w:tc>
+          <w:tcPr>
+            <w:tcW w:type="dxa" w:w="4649"/>
+            <w:vAlign w:val="center"/>
+            <w:tcMar>
+              <w:top w:w="60" w:type="dxa"/>
+              <w:bottom w:w="60" w:type="dxa"/>
+              <w:start w:w="90" w:type="dxa"/>
+              <w:end w:w="90" w:type="dxa"/>
+            </w:tcMar>
+            <w:shd w:val="clear" w:color="auto" w:fill="F2F5FA"/>
+          </w:tcPr>
+          <w:p>
+            <w:pPr>
+              <w:bidi w:val="1"/>
+              <w:spacing w:after="20" w:before="20"/>
+              <w:jc w:val="right"/>
+            </w:pPr>
+            <w:r/>
+            <w:r>
+              <w:rPr>
+                <w:rFonts w:ascii="Tahoma" w:hAnsi="Tahoma" w:cs="Tahoma" w:eastAsia="Tahoma"/>
+                <w:b w:val="0"/>
+                <w:i w:val="0"/>
+                <w:color w:val="262626"/>
+                <w:sz w:val="19"/>
+                <w:szCs w:val="19"/>
+              </w:rPr>
+              <w:t>+$191.02 خالص</w:t>
             </w:r>
           </w:p>
         </w:tc>
@@ -23609,6 +23956,65 @@
       </w:r>
     </w:p>
     <w:p>
+      <w:pPr>
+        <w:bidi w:val="1"/>
+        <w:spacing w:before="80" w:after="40"/>
+        <w:jc w:val="center"/>
+      </w:pPr>
+      <w:r>
+        <w:drawing>
+          <wp:inline xmlns:a="http://schemas.openxmlformats.org/drawingml/2006/main" xmlns:pic="http://schemas.openxmlformats.org/drawingml/2006/picture">
+            <wp:extent cx="6408000" cy="1999198"/>
+            <wp:docPr id="4" name="Picture 4"/>
+            <wp:cNvGraphicFramePr>
+              <a:graphicFrameLocks noChangeAspect="1"/>
+            </wp:cNvGraphicFramePr>
+            <a:graphic>
+              <a:graphicData uri="http://schemas.openxmlformats.org/drawingml/2006/picture">
+                <pic:pic>
+                  <pic:nvPicPr>
+                    <pic:cNvPr id="0" name="chart_funnel.png"/>
+                    <pic:cNvPicPr/>
+                  </pic:nvPicPr>
+                  <pic:blipFill>
+                    <a:blip r:embed="rId14"/>
+                    <a:stretch>
+                      <a:fillRect/>
+                    </a:stretch>
+                  </pic:blipFill>
+                  <pic:spPr>
+                    <a:xfrm>
+                      <a:off x="0" y="0"/>
+                      <a:ext cx="6408000" cy="1999198"/>
+                    </a:xfrm>
+                    <a:prstGeom prst="rect"/>
+                  </pic:spPr>
+                </pic:pic>
+              </a:graphicData>
+            </a:graphic>
+          </wp:inline>
+        </w:drawing>
+      </w:r>
+    </w:p>
+    <w:p>
+      <w:pPr>
+        <w:bidi w:val="1"/>
+        <w:spacing w:after="200"/>
+        <w:jc w:val="center"/>
+      </w:pPr>
+      <w:r>
+        <w:rPr>
+          <w:rFonts w:ascii="Tahoma" w:hAnsi="Tahoma" w:cs="Tahoma" w:eastAsia="Tahoma"/>
+          <w:b w:val="0"/>
+          <w:i/>
+          <w:color w:val="595959"/>
+          <w:sz w:val="17"/>
+          <w:szCs w:val="17"/>
+        </w:rPr>
+        <w:t>شکل ۴ — قیف سیگنال با شمارش واقعی از دیسک: ۸٬۵۹۴ پیام کانال در ۹۰ روز → ۸۸۱ سیگنال پارس‌شده → ۱٬۳۵۸ پای قابل رپلی → فقط ۱۱۰ پای امتیازگیری‌شده (لاگ بایز از ۲۸ آگوست شروع شد) → ۱ عبور از گیت → ۰ اجرای زنده. مقیاس لگاریتمی است.</w:t>
+      </w:r>
+    </w:p>
+    <w:p>
       <w:r>
         <w:br w:type="page"/>
       </w:r>
@@ -23663,8 +24069,8 @@
       <w:r>
         <w:drawing>
           <wp:inline xmlns:a="http://schemas.openxmlformats.org/drawingml/2006/main" xmlns:pic="http://schemas.openxmlformats.org/drawingml/2006/picture">
-            <wp:extent cx="6408000" cy="2621044"/>
-            <wp:docPr id="3" name="Picture 3"/>
+            <wp:extent cx="6408000" cy="2380626"/>
+            <wp:docPr id="5" name="Picture 5"/>
             <wp:cNvGraphicFramePr>
               <a:graphicFrameLocks noChangeAspect="1"/>
             </wp:cNvGraphicFramePr>
@@ -23676,7 +24082,7 @@
                     <pic:cNvPicPr/>
                   </pic:nvPicPr>
                   <pic:blipFill>
-                    <a:blip r:embed="rId13"/>
+                    <a:blip r:embed="rId15"/>
                     <a:stretch>
                       <a:fillRect/>
                     </a:stretch>
@@ -23684,7 +24090,7 @@
                   <pic:spPr>
                     <a:xfrm>
                       <a:off x="0" y="0"/>
-                      <a:ext cx="6408000" cy="2621044"/>
+                      <a:ext cx="6408000" cy="2380626"/>
                     </a:xfrm>
                     <a:prstGeom prst="rect"/>
                   </pic:spPr>
@@ -23710,7 +24116,7 @@
           <w:sz w:val="17"/>
           <w:szCs w:val="17"/>
         </w:rPr>
-        <w:t>شکل ۳ — مقایسهٔ ۷ کانال: سود خالص و حداکثر افت سرمایه در رپلی ۹۰ روزه با لات ثابت.</w:t>
+        <w:t>شکل ۵ — مقایسهٔ ۷ کانال: سود خالص و حداکثر افت سرمایه در رپلی ۹۰ روزه با لات ثابت.</w:t>
       </w:r>
     </w:p>
     <w:p>
@@ -24035,7 +24441,7 @@
                 <w:sz w:val="19"/>
                 <w:szCs w:val="19"/>
               </w:rPr>
-              <w:t>349</w:t>
+              <w:t>366</w:t>
             </w:r>
           </w:p>
         </w:tc>
@@ -24128,7 +24534,7 @@
                 <w:sz w:val="19"/>
                 <w:szCs w:val="19"/>
               </w:rPr>
-              <w:t>82%</w:t>
+              <w:t>78%</w:t>
             </w:r>
           </w:p>
         </w:tc>
@@ -24256,7 +24662,7 @@
                 <w:sz w:val="19"/>
                 <w:szCs w:val="19"/>
               </w:rPr>
-              <w:t>667</w:t>
+              <w:t>716</w:t>
             </w:r>
           </w:p>
         </w:tc>
@@ -24352,7 +24758,7 @@
                 <w:sz w:val="19"/>
                 <w:szCs w:val="19"/>
               </w:rPr>
-              <w:t>53%</w:t>
+              <w:t>50%</w:t>
             </w:r>
           </w:p>
         </w:tc>
@@ -24701,7 +25107,7 @@
                 <w:sz w:val="19"/>
                 <w:szCs w:val="19"/>
               </w:rPr>
-              <w:t>37</w:t>
+              <w:t>38</w:t>
             </w:r>
           </w:p>
         </w:tc>
@@ -24797,7 +25203,7 @@
                 <w:sz w:val="19"/>
                 <w:szCs w:val="19"/>
               </w:rPr>
-              <w:t>57%</w:t>
+              <w:t>55%</w:t>
             </w:r>
           </w:p>
         </w:tc>
@@ -24925,7 +25331,7 @@
                 <w:sz w:val="19"/>
                 <w:szCs w:val="19"/>
               </w:rPr>
-              <w:t>6</w:t>
+              <w:t>7</w:t>
             </w:r>
           </w:p>
         </w:tc>
@@ -25018,7 +25424,7 @@
                 <w:sz w:val="19"/>
                 <w:szCs w:val="19"/>
               </w:rPr>
-              <w:t>33%</w:t>
+              <w:t>29%</w:t>
             </w:r>
           </w:p>
         </w:tc>
@@ -25080,7 +25486,7 @@
                 <w:sz w:val="19"/>
                 <w:szCs w:val="19"/>
               </w:rPr>
-              <w:t>اصلاً طلا نیست</w:t>
+              <w:t>اصلاً طلا نیست (۲۸ پا فیلتر)</w:t>
             </w:r>
           </w:p>
         </w:tc>
@@ -25146,7 +25552,7 @@
                 <w:sz w:val="19"/>
                 <w:szCs w:val="19"/>
               </w:rPr>
-              <w:t>115</w:t>
+              <w:t>118</w:t>
             </w:r>
           </w:p>
         </w:tc>
@@ -25242,7 +25648,7 @@
                 <w:sz w:val="19"/>
                 <w:szCs w:val="19"/>
               </w:rPr>
-              <w:t>76%</w:t>
+              <w:t>74%</w:t>
             </w:r>
           </w:p>
         </w:tc>
@@ -25370,7 +25776,7 @@
                 <w:sz w:val="19"/>
                 <w:szCs w:val="19"/>
               </w:rPr>
-              <w:t>47</w:t>
+              <w:t>50</w:t>
             </w:r>
           </w:p>
         </w:tc>
@@ -25463,7 +25869,7 @@
                 <w:sz w:val="19"/>
                 <w:szCs w:val="19"/>
               </w:rPr>
-              <w:t>15%</w:t>
+              <w:t>14%</w:t>
             </w:r>
           </w:p>
         </w:tc>
@@ -25754,7 +26160,7 @@
                 <w:sz w:val="19"/>
                 <w:szCs w:val="19"/>
               </w:rPr>
-              <w:t>۱۳ روز</w:t>
+              <w:t>۱۲ روز</w:t>
             </w:r>
           </w:p>
         </w:tc>
@@ -25916,7 +26322,7 @@
                 <w:sz w:val="19"/>
                 <w:szCs w:val="19"/>
               </w:rPr>
-              <w:t>سود نرمال‌شده</w:t>
+              <w:t>سود نرمال‌شده @0.01</w:t>
             </w:r>
           </w:p>
         </w:tc>
@@ -25947,7 +26353,7 @@
                 <w:sz w:val="19"/>
                 <w:szCs w:val="19"/>
               </w:rPr>
-              <w:t>+$44.21</w:t>
+              <w:t>+$67.39</w:t>
             </w:r>
           </w:p>
         </w:tc>
@@ -26044,7 +26450,7 @@
                 <w:sz w:val="19"/>
                 <w:szCs w:val="19"/>
               </w:rPr>
-              <w:t>-$167.13</w:t>
+              <w:t>-$168.48</w:t>
             </w:r>
           </w:p>
         </w:tc>
@@ -26140,7 +26546,7 @@
                 <w:sz w:val="19"/>
                 <w:szCs w:val="19"/>
               </w:rPr>
-              <w:t>73.9%</w:t>
+              <w:t>75.0%</w:t>
             </w:r>
           </w:p>
         </w:tc>
@@ -26171,7 +26577,7 @@
                 <w:sz w:val="19"/>
                 <w:szCs w:val="19"/>
               </w:rPr>
-              <w:t>82%</w:t>
+              <w:t>78%</w:t>
             </w:r>
           </w:p>
         </w:tc>
@@ -26237,7 +26643,7 @@
                 <w:sz w:val="19"/>
                 <w:szCs w:val="19"/>
               </w:rPr>
-              <w:t>23</w:t>
+              <w:t>24</w:t>
             </w:r>
           </w:p>
         </w:tc>
@@ -26305,7 +26711,7 @@
           <w:sz w:val="20"/>
           <w:szCs w:val="20"/>
         </w:rPr>
-        <w:t>این مقایسه به نفع goldfree است اما منصفانه نیست: ۱۳ روز در برابر ۹۰ روز، و رپلی بدون اسپرد و بدون lag اجرا. تنها نتیجهٔ قابل‌دفاع این است که «نمی‌دانیم» و داده کم است.</w:t>
+        <w:t>این مقایسه به نفع goldfree است اما منصفانه نیست: ۱۲ روز در برابر ۹۰ روز، و رپلی بدون اسپرد و بدون lag اجرا. تنها نتیجهٔ قابل‌دفاع این است که «نمی‌دانیم» و داده کم است.</w:t>
       </w:r>
     </w:p>
     <w:p>
@@ -28313,7 +28719,7 @@
                 <w:sz w:val="19"/>
                 <w:szCs w:val="19"/>
               </w:rPr>
-              <w:t>تصحیح «۳۴ ترید» به «۲۳ پوزیشن»</w:t>
+              <w:t>تصحیح «۳۴ ترید» به «۲۴ پوزیشن»</w:t>
             </w:r>
           </w:p>
         </w:tc>

</xml_diff>